<commit_message>
Aligner effectif diavina T=140 sur Pascoma/Sport
Conserve 140 élèves (Pascoma 28 000, Sport 70 000).
En-tête: V 82 · L 58 · T 140. Totaux inchangés: 9 386 000 Ar.

Co-authored-by: arena-agent <297053741+arena-agent@users.noreply.github.com>
</commit_message>
<xml_diff>
--- a/PE-RPI-2026-2027.docx
+++ b/PE-RPI-2026-2027.docx
@@ -9357,7 +9357,7 @@
                 <w:i w:val="0"/>
                 <w:sz w:val="22"/>
               </w:rPr>
-              <w:t>145</w:t>
+              <w:t>140</w:t>
             </w:r>
           </w:p>
         </w:tc>
@@ -9423,7 +9423,7 @@
                 <w:i w:val="0"/>
                 <w:sz w:val="22"/>
               </w:rPr>
-              <w:t>72 500</w:t>
+              <w:t>70 000</w:t>
             </w:r>
           </w:p>
         </w:tc>
@@ -9471,7 +9471,7 @@
                 <w:i/>
                 <w:sz w:val="22"/>
               </w:rPr>
-              <w:t>ST : 72 500</w:t>
+              <w:t>ST : 70 000</w:t>
             </w:r>
           </w:p>
         </w:tc>
@@ -10080,7 +10080,7 @@
           <w:i w:val="0"/>
           <w:sz w:val="24"/>
         </w:rPr>
-        <w:t>Nofaranana tamin’ny tetibola : 1 100 500 Ar (RPI (Etat))</w:t>
+        <w:t>Nofaranana tamin’ny tetibola : 1 098 000 Ar (RPI (Etat))</w:t>
       </w:r>
     </w:p>
     <w:p>

</xml_diff>